<commit_message>
Upload Report Production Oktober 2026.docx via Zeta Client
</commit_message>
<xml_diff>
--- a/PRODUKSI/REPORT/Report Production Oktober 2026.docx
+++ b/PRODUKSI/REPORT/Report Production Oktober 2026.docx
@@ -22,18 +22,26 @@
           <w:bCs/>
         </w:rPr>
         <w:drawing>
-          <wp:anchor distT="0" distB="0" distL="114300" distR="114300" simplePos="0" relativeHeight="251658240" behindDoc="1" locked="0" layoutInCell="1" allowOverlap="1" wp14:anchorId="395C72ED" wp14:editId="468E18E8">
+          <wp:anchor distT="0" distB="0" distL="114300" distR="114300" simplePos="0" relativeHeight="251659264" behindDoc="1" locked="0" layoutInCell="1" allowOverlap="1" wp14:anchorId="7C5728FC" wp14:editId="0C757D4D">
             <wp:simplePos x="0" y="0"/>
             <wp:positionH relativeFrom="column">
-              <wp:posOffset>-800100</wp:posOffset>
+              <wp:posOffset>-391160</wp:posOffset>
             </wp:positionH>
             <wp:positionV relativeFrom="paragraph">
-              <wp:posOffset>433705</wp:posOffset>
+              <wp:posOffset>290830</wp:posOffset>
             </wp:positionV>
-            <wp:extent cx="7355840" cy="4162425"/>
-            <wp:effectExtent l="0" t="0" r="0" b="9525"/>
-            <wp:wrapSquare wrapText="bothSides"/>
-            <wp:docPr id="1264842519" name="Picture 1"/>
+            <wp:extent cx="6677025" cy="2886710"/>
+            <wp:effectExtent l="0" t="0" r="9525" b="8890"/>
+            <wp:wrapTight wrapText="bothSides">
+              <wp:wrapPolygon edited="0">
+                <wp:start x="0" y="0"/>
+                <wp:lineTo x="0" y="21524"/>
+                <wp:lineTo x="21569" y="21524"/>
+                <wp:lineTo x="21569" y="0"/>
+                <wp:lineTo x="0" y="0"/>
+              </wp:wrapPolygon>
+            </wp:wrapTight>
+            <wp:docPr id="1983755167" name="Picture 1"/>
             <wp:cNvGraphicFramePr>
               <a:graphicFrameLocks xmlns:a="http://schemas.openxmlformats.org/drawingml/2006/main" noChangeAspect="1"/>
             </wp:cNvGraphicFramePr>
@@ -41,7 +49,7 @@
               <a:graphicData uri="http://schemas.openxmlformats.org/drawingml/2006/picture">
                 <pic:pic xmlns:pic="http://schemas.openxmlformats.org/drawingml/2006/picture">
                   <pic:nvPicPr>
-                    <pic:cNvPr id="1264842519" name=""/>
+                    <pic:cNvPr id="1983755167" name=""/>
                     <pic:cNvPicPr/>
                   </pic:nvPicPr>
                   <pic:blipFill>
@@ -59,7 +67,7 @@
                   <pic:spPr>
                     <a:xfrm>
                       <a:off x="0" y="0"/>
-                      <a:ext cx="7355840" cy="4162425"/>
+                      <a:ext cx="6677025" cy="2886710"/>
                     </a:xfrm>
                     <a:prstGeom prst="rect">
                       <a:avLst/>
@@ -77,127 +85,299 @@
           </wp:anchor>
         </w:drawing>
       </w:r>
-      <w:proofErr w:type="spellStart"/>
       <w:r>
         <w:rPr>
           <w:rFonts w:ascii="Times New Roman" w:hAnsi="Times New Roman" w:cs="Times New Roman"/>
           <w:b/>
           <w:bCs/>
         </w:rPr>
+        <w:t>Rom Inventory CIL Processing Plant Oktober 2026</w:t>
+      </w:r>
+    </w:p>
+    <w:p>
+      <w:pPr>
+        <w:pStyle w:val="ListParagraph"/>
+        <w:ind w:left="-567"/>
+      </w:pPr>
+      <w:proofErr w:type="spellStart"/>
+      <w:r>
+        <w:t>Estimasi</w:t>
+      </w:r>
+      <w:proofErr w:type="spellEnd"/>
+      <w:r>
+        <w:t xml:space="preserve"> </w:t>
+      </w:r>
+      <w:proofErr w:type="spellStart"/>
+      <w:r>
         <w:t>Tonage</w:t>
       </w:r>
       <w:proofErr w:type="spellEnd"/>
       <w:r>
+        <w:t xml:space="preserve"> </w:t>
+      </w:r>
+      <w:r>
+        <w:t xml:space="preserve">yang </w:t>
+      </w:r>
+      <w:proofErr w:type="spellStart"/>
+      <w:r>
+        <w:t>berada</w:t>
+      </w:r>
+      <w:proofErr w:type="spellEnd"/>
+      <w:r>
+        <w:t xml:space="preserve"> di ROM </w:t>
+      </w:r>
+      <w:proofErr w:type="spellStart"/>
+      <w:r>
+        <w:t>dari</w:t>
+      </w:r>
+      <w:proofErr w:type="spellEnd"/>
+      <w:r>
+        <w:t xml:space="preserve"> data Survey </w:t>
+      </w:r>
+      <w:r>
+        <w:rPr>
+          <w:b/>
+          <w:bCs/>
+        </w:rPr>
+        <w:t>1.942 Ton (</w:t>
+      </w:r>
+      <w:r>
+        <w:t>WMT).</w:t>
+      </w:r>
+    </w:p>
+    <w:p>
+      <w:pPr>
+        <w:pStyle w:val="ListParagraph"/>
+        <w:ind w:left="-567"/>
+      </w:pPr>
+    </w:p>
+    <w:p>
+      <w:pPr>
+        <w:pStyle w:val="ListParagraph"/>
+        <w:numPr>
+          <w:ilvl w:val="0"/>
+          <w:numId w:val="1"/>
+        </w:numPr>
+        <w:ind w:left="-426"/>
+        <w:rPr>
+          <w:b/>
+          <w:bCs/>
+        </w:rPr>
+      </w:pPr>
+      <w:r>
+        <w:rPr>
+          <w:b/>
+          <w:bCs/>
+        </w:rPr>
+        <w:drawing>
+          <wp:anchor distT="0" distB="0" distL="114300" distR="114300" simplePos="0" relativeHeight="251660288" behindDoc="1" locked="0" layoutInCell="1" allowOverlap="1" wp14:anchorId="6F8ACADD" wp14:editId="34E43D9B">
+            <wp:simplePos x="0" y="0"/>
+            <wp:positionH relativeFrom="column">
+              <wp:posOffset>-267335</wp:posOffset>
+            </wp:positionH>
+            <wp:positionV relativeFrom="paragraph">
+              <wp:posOffset>213360</wp:posOffset>
+            </wp:positionV>
+            <wp:extent cx="6657975" cy="3047365"/>
+            <wp:effectExtent l="0" t="0" r="9525" b="635"/>
+            <wp:wrapTight wrapText="bothSides">
+              <wp:wrapPolygon edited="0">
+                <wp:start x="0" y="0"/>
+                <wp:lineTo x="0" y="21469"/>
+                <wp:lineTo x="21569" y="21469"/>
+                <wp:lineTo x="21569" y="0"/>
+                <wp:lineTo x="0" y="0"/>
+              </wp:wrapPolygon>
+            </wp:wrapTight>
+            <wp:docPr id="183762775" name="Picture 1"/>
+            <wp:cNvGraphicFramePr>
+              <a:graphicFrameLocks xmlns:a="http://schemas.openxmlformats.org/drawingml/2006/main" noChangeAspect="1"/>
+            </wp:cNvGraphicFramePr>
+            <a:graphic xmlns:a="http://schemas.openxmlformats.org/drawingml/2006/main">
+              <a:graphicData uri="http://schemas.openxmlformats.org/drawingml/2006/picture">
+                <pic:pic xmlns:pic="http://schemas.openxmlformats.org/drawingml/2006/picture">
+                  <pic:nvPicPr>
+                    <pic:cNvPr id="183762775" name=""/>
+                    <pic:cNvPicPr/>
+                  </pic:nvPicPr>
+                  <pic:blipFill>
+                    <a:blip r:embed="rId8">
+                      <a:extLst>
+                        <a:ext uri="{28A0092B-C50C-407E-A947-70E740481C1C}">
+                          <a14:useLocalDpi xmlns:a14="http://schemas.microsoft.com/office/drawing/2010/main" val="0"/>
+                        </a:ext>
+                      </a:extLst>
+                    </a:blip>
+                    <a:stretch>
+                      <a:fillRect/>
+                    </a:stretch>
+                  </pic:blipFill>
+                  <pic:spPr>
+                    <a:xfrm>
+                      <a:off x="0" y="0"/>
+                      <a:ext cx="6657975" cy="3047365"/>
+                    </a:xfrm>
+                    <a:prstGeom prst="rect">
+                      <a:avLst/>
+                    </a:prstGeom>
+                  </pic:spPr>
+                </pic:pic>
+              </a:graphicData>
+            </a:graphic>
+            <wp14:sizeRelH relativeFrom="margin">
+              <wp14:pctWidth>0</wp14:pctWidth>
+            </wp14:sizeRelH>
+            <wp14:sizeRelV relativeFrom="margin">
+              <wp14:pctHeight>0</wp14:pctHeight>
+            </wp14:sizeRelV>
+          </wp:anchor>
+        </w:drawing>
+      </w:r>
+      <w:r>
+        <w:rPr>
+          <w:b/>
+          <w:bCs/>
+        </w:rPr>
+        <w:t>Crushing Production Oktober 2026</w:t>
+      </w:r>
+    </w:p>
+    <w:p>
+      <w:pPr>
+        <w:pStyle w:val="ListParagraph"/>
+        <w:ind w:left="-567"/>
+      </w:pPr>
+      <w:r>
+        <w:t xml:space="preserve">Total tonnage </w:t>
+      </w:r>
+      <w:proofErr w:type="spellStart"/>
+      <w:r>
+        <w:t>produksi</w:t>
+      </w:r>
+      <w:proofErr w:type="spellEnd"/>
+      <w:r>
+        <w:t xml:space="preserve"> yang </w:t>
+      </w:r>
+      <w:proofErr w:type="spellStart"/>
+      <w:r>
+        <w:t>sudah</w:t>
+      </w:r>
+      <w:proofErr w:type="spellEnd"/>
+      <w:r>
+        <w:t xml:space="preserve"> </w:t>
+      </w:r>
+      <w:proofErr w:type="spellStart"/>
+      <w:r>
+        <w:t>dilakukan</w:t>
+      </w:r>
+      <w:proofErr w:type="spellEnd"/>
+      <w:r>
+        <w:t xml:space="preserve"> proses crashing di periode Oktober 2026 </w:t>
+      </w:r>
+      <w:proofErr w:type="spellStart"/>
+      <w:r>
+        <w:t>adalah</w:t>
+      </w:r>
+      <w:proofErr w:type="spellEnd"/>
+      <w:r>
+        <w:t xml:space="preserve"> </w:t>
+      </w:r>
+      <w:r>
+        <w:rPr>
+          <w:b/>
+          <w:bCs/>
+        </w:rPr>
+        <w:t xml:space="preserve">1.913 Ton </w:t>
+      </w:r>
+      <w:r>
+        <w:t xml:space="preserve">update </w:t>
+      </w:r>
+      <w:proofErr w:type="spellStart"/>
+      <w:r>
+        <w:t>hingga</w:t>
+      </w:r>
+      <w:proofErr w:type="spellEnd"/>
+      <w:r>
+        <w:t xml:space="preserve"> 26/10/2026. </w:t>
+      </w:r>
+    </w:p>
+    <w:p>
+      <w:pPr>
+        <w:pStyle w:val="ListParagraph"/>
+        <w:ind w:left="-426"/>
         <w:rPr>
           <w:rFonts w:ascii="Times New Roman" w:hAnsi="Times New Roman" w:cs="Times New Roman"/>
           <w:b/>
           <w:bCs/>
         </w:rPr>
-        <w:t xml:space="preserve"> Crushing </w:t>
-      </w:r>
-      <w:r>
+      </w:pPr>
+    </w:p>
+    <w:p>
+      <w:pPr>
+        <w:pStyle w:val="ListParagraph"/>
+        <w:ind w:left="-426"/>
         <w:rPr>
           <w:rFonts w:ascii="Times New Roman" w:hAnsi="Times New Roman" w:cs="Times New Roman"/>
           <w:b/>
           <w:bCs/>
         </w:rPr>
-        <w:t>Production</w:t>
-      </w:r>
+      </w:pPr>
     </w:p>
-    <w:p/>
+    <w:p>
+      <w:pPr>
+        <w:pStyle w:val="ListParagraph"/>
+        <w:ind w:left="-426"/>
+        <w:rPr>
+          <w:rFonts w:ascii="Times New Roman" w:hAnsi="Times New Roman" w:cs="Times New Roman"/>
+          <w:b/>
+          <w:bCs/>
+        </w:rPr>
+      </w:pPr>
+    </w:p>
+    <w:p>
+      <w:pPr>
+        <w:pStyle w:val="ListParagraph"/>
+        <w:ind w:left="-426"/>
+        <w:rPr>
+          <w:rFonts w:ascii="Times New Roman" w:hAnsi="Times New Roman" w:cs="Times New Roman"/>
+          <w:b/>
+          <w:bCs/>
+        </w:rPr>
+      </w:pPr>
+    </w:p>
+    <w:p>
+      <w:pPr>
+        <w:pStyle w:val="ListParagraph"/>
+        <w:ind w:left="-426"/>
+        <w:rPr>
+          <w:rFonts w:ascii="Times New Roman" w:hAnsi="Times New Roman" w:cs="Times New Roman"/>
+          <w:b/>
+          <w:bCs/>
+        </w:rPr>
+      </w:pPr>
+    </w:p>
     <w:p>
       <w:pPr>
         <w:pStyle w:val="ListParagraph"/>
         <w:numPr>
           <w:ilvl w:val="0"/>
-          <w:numId w:val="2"/>
+          <w:numId w:val="1"/>
         </w:numPr>
-        <w:ind w:left="-567"/>
+        <w:ind w:left="-426"/>
         <w:rPr>
+          <w:rFonts w:ascii="Times New Roman" w:hAnsi="Times New Roman" w:cs="Times New Roman"/>
           <w:b/>
           <w:bCs/>
         </w:rPr>
       </w:pPr>
-      <w:proofErr w:type="spellStart"/>
-      <w:r>
-        <w:t>Estimassi</w:t>
-      </w:r>
-      <w:proofErr w:type="spellEnd"/>
-      <w:r>
-        <w:t xml:space="preserve"> </w:t>
-      </w:r>
-      <w:proofErr w:type="spellStart"/>
-      <w:r>
-        <w:t>Tonage</w:t>
-      </w:r>
-      <w:proofErr w:type="spellEnd"/>
-      <w:r>
-        <w:t xml:space="preserve"> yang </w:t>
-      </w:r>
-      <w:proofErr w:type="spellStart"/>
-      <w:r>
-        <w:t>sudah</w:t>
-      </w:r>
-      <w:proofErr w:type="spellEnd"/>
-      <w:r>
-        <w:t xml:space="preserve"> </w:t>
-      </w:r>
-      <w:proofErr w:type="spellStart"/>
-      <w:r>
-        <w:t>dilakukan</w:t>
-      </w:r>
-      <w:proofErr w:type="spellEnd"/>
-      <w:r>
-        <w:t xml:space="preserve"> proses crushing </w:t>
-      </w:r>
-      <w:proofErr w:type="spellStart"/>
-      <w:r>
-        <w:t>dari</w:t>
-      </w:r>
-      <w:proofErr w:type="spellEnd"/>
-      <w:r>
-        <w:t xml:space="preserve"> Stock Rom CIL </w:t>
-      </w:r>
-      <w:proofErr w:type="spellStart"/>
-      <w:r>
-        <w:t>dari</w:t>
-      </w:r>
-      <w:proofErr w:type="spellEnd"/>
-      <w:r>
-        <w:t xml:space="preserve"> </w:t>
-      </w:r>
-      <w:proofErr w:type="spellStart"/>
-      <w:r>
-        <w:t>tanggal</w:t>
-      </w:r>
-      <w:proofErr w:type="spellEnd"/>
-      <w:r>
-        <w:t xml:space="preserve"> 1 Oktober – 26 Oktober 2026 </w:t>
-      </w:r>
-      <w:proofErr w:type="spellStart"/>
-      <w:r>
-        <w:t>adalah</w:t>
-      </w:r>
-      <w:proofErr w:type="spellEnd"/>
-      <w:r>
-        <w:t xml:space="preserve"> </w:t>
-      </w:r>
       <w:r>
         <w:rPr>
+          <w:rFonts w:ascii="Times New Roman" w:hAnsi="Times New Roman" w:cs="Times New Roman"/>
           <w:b/>
           <w:bCs/>
         </w:rPr>
-        <w:t>2.904 Ton.</w:t>
-      </w:r>
-    </w:p>
-    <w:p>
-      <w:pPr>
-        <w:pStyle w:val="ListParagraph"/>
-        <w:rPr>
-          <w:b/>
-          <w:bCs/>
-        </w:rPr>
-      </w:pPr>
+        <w:lastRenderedPageBreak/>
+        <w:t>Material Process Milling are and Leaching Are Production (Upstream) Oktober 2026</w:t>
+      </w:r>
     </w:p>
     <w:p/>
     <w:p>
@@ -222,7 +402,7 @@
     <w:p/>
     <w:p/>
     <w:sectPr>
-      <w:headerReference w:type="default" r:id="rId8"/>
+      <w:headerReference w:type="default" r:id="rId9"/>
       <w:pgSz w:w="11906" w:h="16838"/>
       <w:pgMar w:top="1440" w:right="1440" w:bottom="1440" w:left="1440" w:header="708" w:footer="708" w:gutter="0"/>
       <w:cols w:space="708"/>

</xml_diff>